<commit_message>
Update DCEA section: re-embed labeled equity-plane figures, add headline finding
Re-embeds Figures 9-10 with the malaria-treatment label now visible,
and adds one plain-language sentence naming pediatric malaria
treatment as the single intervention driving 74% of the package's net
benefit and 89% of its wealth-quintile inequality impact.
</commit_message>
<xml_diff>
--- a/reports/Defining_Health_Benefits_Package_in_Senegal_ResultsNote_v13.docx
+++ b/reports/Defining_Health_Benefits_Package_in_Senegal_ResultsNote_v13.docx
@@ -6948,6 +6948,15 @@
     </w:p>
     <w:p>
       <w:pPr>
+        <w:pStyle w:val="BodyText"/>
+        <w:jc w:val="both"/>
+      </w:pPr>
+      <w:r>
+        <w:t>A single intervention drives most of both figures: pediatric malaria treatment alone contributes 53.3 of the package's 71.9 million DALYs of net benefit (74%) and 8.7 of its 9.8 million DALY-equivalent wealth-quintile inequality impact (89%). The package's equity profile is therefore set largely by this one intervention rather than spread evenly across the other 84.</w:t>
+      </w:r>
+    </w:p>
+    <w:p>
+      <w:pPr>
         <w:pStyle w:val="ImageCaption"/>
       </w:pPr>
       <w:r>
@@ -6962,43 +6971,32 @@
         <w:pStyle w:val="CaptionedFigure"/>
       </w:pPr>
       <w:r>
-        <w:rPr>
-          <w:rFonts w:ascii="Arial" w:hAnsi="Arial" w:cs="Arial" w:eastAsia="Arial"/>
-        </w:rPr>
         <w:drawing>
           <wp:inline>
-            <wp:extent cx="5334000" cy="4148666"/>
-            <wp:effectExtent b="0" l="0" r="0" t="0"/>
-            <wp:docPr descr="Health equity impact plane, wealth quintile" title="" id="56" name="Picture"/>
+            <wp:extent cx="5330952" cy="4146296"/>
+            <wp:docPr id="81" name="Picture 81"/>
+            <wp:cNvGraphicFramePr>
+              <a:graphicFrameLocks noChangeAspect="1"/>
+            </wp:cNvGraphicFramePr>
             <a:graphic>
               <a:graphicData uri="http://schemas.openxmlformats.org/drawingml/2006/picture">
                 <pic:pic>
                   <pic:nvPicPr>
-                    <pic:cNvPr descr="assets/dcea_equity_plane_wealth.png" id="57" name="Picture"/>
-                    <pic:cNvPicPr>
-                      <a:picLocks noChangeArrowheads="1" noChangeAspect="1"/>
-                    </pic:cNvPicPr>
+                    <pic:cNvPr id="0" name="dcea_equity_plane_wealth.png"/>
+                    <pic:cNvPicPr/>
                   </pic:nvPicPr>
                   <pic:blipFill>
-                    <a:blip r:embed="rId55"/>
+                    <a:blip r:embed="rId32"/>
                     <a:stretch>
                       <a:fillRect/>
                     </a:stretch>
                   </pic:blipFill>
-                  <pic:spPr bwMode="auto">
+                  <pic:spPr>
                     <a:xfrm>
                       <a:off x="0" y="0"/>
-                      <a:ext cx="5334000" cy="4148666"/>
+                      <a:ext cx="5330952" cy="4146296"/>
                     </a:xfrm>
-                    <a:prstGeom prst="rect">
-                      <a:avLst/>
-                    </a:prstGeom>
-                    <a:noFill/>
-                    <a:ln w="9525">
-                      <a:noFill/>
-                      <a:headEnd/>
-                      <a:tailEnd/>
-                    </a:ln>
+                    <a:prstGeom prst="rect"/>
                   </pic:spPr>
                 </pic:pic>
               </a:graphicData>
@@ -7023,43 +7021,32 @@
         <w:pStyle w:val="CaptionedFigure"/>
       </w:pPr>
       <w:r>
-        <w:rPr>
-          <w:rFonts w:ascii="Arial" w:hAnsi="Arial" w:cs="Arial" w:eastAsia="Arial"/>
-        </w:rPr>
         <w:drawing>
           <wp:inline>
-            <wp:extent cx="5334000" cy="4148666"/>
-            <wp:effectExtent b="0" l="0" r="0" t="0"/>
-            <wp:docPr descr="Health equity impact plane, residence" title="" id="59" name="Picture"/>
+            <wp:extent cx="5330952" cy="4146296"/>
+            <wp:docPr id="82" name="Picture 82"/>
+            <wp:cNvGraphicFramePr>
+              <a:graphicFrameLocks noChangeAspect="1"/>
+            </wp:cNvGraphicFramePr>
             <a:graphic>
               <a:graphicData uri="http://schemas.openxmlformats.org/drawingml/2006/picture">
                 <pic:pic>
                   <pic:nvPicPr>
-                    <pic:cNvPr descr="assets/dcea_equity_plane_residence.png" id="60" name="Picture"/>
-                    <pic:cNvPicPr>
-                      <a:picLocks noChangeArrowheads="1" noChangeAspect="1"/>
-                    </pic:cNvPicPr>
+                    <pic:cNvPr id="0" name="dcea_equity_plane_residence.png"/>
+                    <pic:cNvPicPr/>
                   </pic:nvPicPr>
                   <pic:blipFill>
-                    <a:blip r:embed="rId58"/>
+                    <a:blip r:embed="rId33"/>
                     <a:stretch>
                       <a:fillRect/>
                     </a:stretch>
                   </pic:blipFill>
-                  <pic:spPr bwMode="auto">
+                  <pic:spPr>
                     <a:xfrm>
                       <a:off x="0" y="0"/>
-                      <a:ext cx="5334000" cy="4148666"/>
+                      <a:ext cx="5330952" cy="4146296"/>
                     </a:xfrm>
-                    <a:prstGeom prst="rect">
-                      <a:avLst/>
-                    </a:prstGeom>
-                    <a:noFill/>
-                    <a:ln w="9525">
-                      <a:noFill/>
-                      <a:headEnd/>
-                      <a:tailEnd/>
-                    </a:ln>
+                    <a:prstGeom prst="rect"/>
                   </pic:spPr>
                 </pic:pic>
               </a:graphicData>

</xml_diff>